<commit_message>
Volume 1, Chapter 2: project-setup steps (every project created by its own tools)
</commit_message>
<xml_diff>
--- a/Volume 1/Chapter 02 - Language Fundamentals/SPA_Vol1_Ch2_Lesson2_10_Modules.docx
+++ b/Volume 1/Chapter 02 - Language Fundamentals/SPA_Vol1_Ch2_Lesson2_10_Modules.docx
@@ -915,7 +915,7 @@
         <w:keepNext/>
       </w:pPr>
       <w:r>
-        <w:t>Save each source and supporting file from this lesson into the matching path in the project layout. As in Chapter 1, notepad .\c\basic\main.c creates and opens one: choose Yes, type the file, save it with Ctrl+S, and close Notepad. Then install the TypeScript compiler for this project.</w:t>
+        <w:t>Next, let the tools create each project's settings file. Remember, -o names the project folder; you replace the starter Program.cs with this lesson's code in the C# section. Remember, go.mod makes the folder a module; its go line shows the Go version you have installed.</w:t>
       </w:r>
     </w:p>
     <w:p>
@@ -926,9 +926,298 @@
     <w:p>
       <w:pPr>
         <w:pStyle w:val="CommandBlock"/>
-      </w:pPr>
-      <w:r>
-        <w:t>npm --prefix .\typescript install --ignore-scripts --no-audit --no-fund</w:t>
+        <w:keepNext/>
+      </w:pPr>
+      <w:r>
+        <w:t>dotnet new console -o .\csharp\BasicRecord</w:t>
+      </w:r>
+    </w:p>
+    <w:p>
+      <w:pPr>
+        <w:pStyle w:val="CommandBlock"/>
+        <w:keepNext/>
+      </w:pPr>
+      <w:r>
+        <w:t>dotnet new console -o .\csharp\Record</w:t>
+      </w:r>
+    </w:p>
+    <w:p>
+      <w:pPr>
+        <w:pStyle w:val="CommandBlock"/>
+      </w:pPr>
+      <w:r>
+        <w:t>go -C .\go mod init example.com/modules</w:t>
+      </w:r>
+    </w:p>
+    <w:p>
+      <w:pPr>
+        <w:keepNext/>
+      </w:pPr>
+    </w:p>
+    <w:p>
+      <w:pPr>
+        <w:keepNext/>
+      </w:pPr>
+      <w:r>
+        <w:t>Then make the TypeScript project's package.json. Remember, npm init -y, npm pkg, then npm install, inside .\typescript: Push-Location moves into it and Pop-Location moves back to lesson-2.10.</w:t>
+      </w:r>
+    </w:p>
+    <w:p>
+      <w:pPr>
+        <w:keepNext/>
+      </w:pPr>
+    </w:p>
+    <w:p>
+      <w:pPr>
+        <w:pStyle w:val="CommandBlock"/>
+        <w:keepNext/>
+      </w:pPr>
+      <w:r>
+        <w:t>Push-Location .\typescript</w:t>
+      </w:r>
+    </w:p>
+    <w:p>
+      <w:pPr>
+        <w:pStyle w:val="CommandBlock"/>
+        <w:keepNext/>
+      </w:pPr>
+      <w:r>
+        <w:t>npm init -y</w:t>
+      </w:r>
+    </w:p>
+    <w:p>
+      <w:pPr>
+        <w:pStyle w:val="CommandBlock"/>
+        <w:keepNext/>
+      </w:pPr>
+      <w:r>
+        <w:t>npm pkg set name=record-typescript type=module</w:t>
+      </w:r>
+    </w:p>
+    <w:p>
+      <w:pPr>
+        <w:pStyle w:val="CommandBlock"/>
+        <w:keepNext/>
+      </w:pPr>
+      <w:r>
+        <w:t>npm pkg set private=true --json</w:t>
+      </w:r>
+    </w:p>
+    <w:p>
+      <w:pPr>
+        <w:pStyle w:val="CommandBlock"/>
+        <w:keepNext/>
+      </w:pPr>
+      <w:r>
+        <w:t>npm pkg set "scripts.check=tsc --noEmit" "scripts.build=tsc --noEmitOnError"</w:t>
+      </w:r>
+    </w:p>
+    <w:p>
+      <w:pPr>
+        <w:pStyle w:val="CommandBlock"/>
+        <w:keepNext/>
+      </w:pPr>
+      <w:r>
+        <w:t>npm pkg delete version description main keywords author license scripts.test</w:t>
+      </w:r>
+    </w:p>
+    <w:p>
+      <w:pPr>
+        <w:pStyle w:val="CommandBlock"/>
+        <w:keepNext/>
+      </w:pPr>
+      <w:r>
+        <w:t>npm install --save-dev --save-exact typescript@7.0.2 @types/node@24.13.5 `</w:t>
+      </w:r>
+    </w:p>
+    <w:p>
+      <w:pPr>
+        <w:pStyle w:val="CommandBlock"/>
+        <w:keepNext/>
+      </w:pPr>
+      <w:r>
+        <w:t xml:space="preserve">    --ignore-scripts --no-audit --no-fund</w:t>
+      </w:r>
+    </w:p>
+    <w:p>
+      <w:pPr>
+        <w:pStyle w:val="CommandBlock"/>
+      </w:pPr>
+      <w:r>
+        <w:t>Pop-Location</w:t>
+      </w:r>
+    </w:p>
+    <w:p>
+      <w:pPr>
+        <w:keepNext/>
+      </w:pPr>
+    </w:p>
+    <w:p>
+      <w:r>
+        <w:t>Then type the TypeScript compiler settings. As in Chapter 1, notepad .\typescript\tsconfig.json creates and opens the file: choose Yes, type the file, save it with Ctrl+S, and close Notepad.</w:t>
+      </w:r>
+    </w:p>
+    <w:p>
+      <w:pPr>
+        <w:keepNext/>
+      </w:pPr>
+    </w:p>
+    <w:p>
+      <w:pPr>
+        <w:pStyle w:val="Heading3"/>
+      </w:pPr>
+      <w:r>
+        <w:t>typescript/tsconfig.json</w:t>
+      </w:r>
+    </w:p>
+    <w:p>
+      <w:pPr>
+        <w:pStyle w:val="SourceCode"/>
+        <w:keepNext/>
+      </w:pPr>
+      <w:r>
+        <w:t>{</w:t>
+      </w:r>
+    </w:p>
+    <w:p>
+      <w:pPr>
+        <w:pStyle w:val="SourceCode"/>
+        <w:keepNext/>
+      </w:pPr>
+      <w:r>
+        <w:t xml:space="preserve">  "compilerOptions": {</w:t>
+      </w:r>
+    </w:p>
+    <w:p>
+      <w:pPr>
+        <w:pStyle w:val="SourceCode"/>
+      </w:pPr>
+      <w:r>
+        <w:t xml:space="preserve">    "target": "ES2022",</w:t>
+      </w:r>
+    </w:p>
+    <w:p>
+      <w:pPr>
+        <w:pStyle w:val="SourceCode"/>
+      </w:pPr>
+      <w:r>
+        <w:t xml:space="preserve">    "module": "NodeNext",</w:t>
+      </w:r>
+    </w:p>
+    <w:p>
+      <w:pPr>
+        <w:pStyle w:val="SourceCode"/>
+      </w:pPr>
+      <w:r>
+        <w:t xml:space="preserve">    "moduleResolution": "NodeNext",</w:t>
+      </w:r>
+    </w:p>
+    <w:p>
+      <w:pPr>
+        <w:pStyle w:val="SourceCode"/>
+      </w:pPr>
+      <w:r>
+        <w:t xml:space="preserve">    "rootDir": "src",</w:t>
+      </w:r>
+    </w:p>
+    <w:p>
+      <w:pPr>
+        <w:pStyle w:val="SourceCode"/>
+      </w:pPr>
+      <w:r>
+        <w:t xml:space="preserve">    "outDir": "dist",</w:t>
+      </w:r>
+    </w:p>
+    <w:p>
+      <w:pPr>
+        <w:pStyle w:val="SourceCode"/>
+      </w:pPr>
+      <w:r>
+        <w:t xml:space="preserve">    "strict": true,</w:t>
+      </w:r>
+    </w:p>
+    <w:p>
+      <w:pPr>
+        <w:pStyle w:val="SourceCode"/>
+      </w:pPr>
+      <w:r>
+        <w:t xml:space="preserve">    "types": [</w:t>
+      </w:r>
+    </w:p>
+    <w:p>
+      <w:pPr>
+        <w:pStyle w:val="SourceCode"/>
+      </w:pPr>
+      <w:r>
+        <w:t xml:space="preserve">      "node"</w:t>
+      </w:r>
+    </w:p>
+    <w:p>
+      <w:pPr>
+        <w:pStyle w:val="SourceCode"/>
+      </w:pPr>
+      <w:r>
+        <w:t xml:space="preserve">    ],</w:t>
+      </w:r>
+    </w:p>
+    <w:p>
+      <w:pPr>
+        <w:pStyle w:val="SourceCode"/>
+      </w:pPr>
+      <w:r>
+        <w:t xml:space="preserve">    "moduleDetection": "force"</w:t>
+      </w:r>
+    </w:p>
+    <w:p>
+      <w:pPr>
+        <w:pStyle w:val="SourceCode"/>
+      </w:pPr>
+      <w:r>
+        <w:t xml:space="preserve">  },</w:t>
+      </w:r>
+    </w:p>
+    <w:p>
+      <w:pPr>
+        <w:pStyle w:val="SourceCode"/>
+      </w:pPr>
+      <w:r>
+        <w:t xml:space="preserve">  "include": [</w:t>
+      </w:r>
+    </w:p>
+    <w:p>
+      <w:pPr>
+        <w:pStyle w:val="SourceCode"/>
+        <w:keepNext/>
+      </w:pPr>
+      <w:r>
+        <w:t xml:space="preserve">    "src/**/*.ts"</w:t>
+      </w:r>
+    </w:p>
+    <w:p>
+      <w:pPr>
+        <w:pStyle w:val="SourceCode"/>
+        <w:keepNext/>
+      </w:pPr>
+      <w:r>
+        <w:t xml:space="preserve">  ]</w:t>
+      </w:r>
+    </w:p>
+    <w:p>
+      <w:pPr>
+        <w:pStyle w:val="SourceCode"/>
+      </w:pPr>
+      <w:r>
+        <w:t>}</w:t>
+      </w:r>
+    </w:p>
+    <w:p>
+      <w:pPr>
+        <w:keepNext/>
+      </w:pPr>
+    </w:p>
+    <w:p>
+      <w:r>
+        <w:t>You save each source file in its language's section below, as each is shown, the same way.</w:t>
       </w:r>
     </w:p>
     <w:p>
@@ -1016,7 +1305,7 @@
         <w:keepNext/>
       </w:pPr>
       <w:r>
-        <w:t>Save each source and supporting file from this lesson into the matching path in the project layout. As in Chapter 1, nano ./c/basic/main.c creates and opens one: type the file, then save and close it with Ctrl+O, Enter, then Ctrl+X. Then install the TypeScript compiler for this project.</w:t>
+        <w:t>Then create the C#, Go, and TypeScript project files with the same commands as on Windows; cd moves into ./typescript for the npm lines, and cd .. moves back.</w:t>
       </w:r>
     </w:p>
     <w:p>
@@ -1027,9 +1316,118 @@
     <w:p>
       <w:pPr>
         <w:pStyle w:val="CommandBlock"/>
-      </w:pPr>
-      <w:r>
-        <w:t>npm --prefix ./typescript install --ignore-scripts --no-audit --no-fund</w:t>
+        <w:keepNext/>
+      </w:pPr>
+      <w:r>
+        <w:t>dotnet new console -o ./csharp/BasicRecord</w:t>
+      </w:r>
+    </w:p>
+    <w:p>
+      <w:pPr>
+        <w:pStyle w:val="CommandBlock"/>
+        <w:keepNext/>
+      </w:pPr>
+      <w:r>
+        <w:t>dotnet new console -o ./csharp/Record</w:t>
+      </w:r>
+    </w:p>
+    <w:p>
+      <w:pPr>
+        <w:pStyle w:val="CommandBlock"/>
+        <w:keepNext/>
+      </w:pPr>
+      <w:r>
+        <w:t>go -C ./go mod init example.com/modules</w:t>
+      </w:r>
+    </w:p>
+    <w:p>
+      <w:pPr>
+        <w:pStyle w:val="CommandBlock"/>
+        <w:keepNext/>
+      </w:pPr>
+      <w:r>
+        <w:t>cd ./typescript</w:t>
+      </w:r>
+    </w:p>
+    <w:p>
+      <w:pPr>
+        <w:pStyle w:val="CommandBlock"/>
+        <w:keepNext/>
+      </w:pPr>
+      <w:r>
+        <w:t>npm init -y</w:t>
+      </w:r>
+    </w:p>
+    <w:p>
+      <w:pPr>
+        <w:pStyle w:val="CommandBlock"/>
+        <w:keepNext/>
+      </w:pPr>
+      <w:r>
+        <w:t>npm pkg set name=record-typescript type=module</w:t>
+      </w:r>
+    </w:p>
+    <w:p>
+      <w:pPr>
+        <w:pStyle w:val="CommandBlock"/>
+        <w:keepNext/>
+      </w:pPr>
+      <w:r>
+        <w:t>npm pkg set private=true --json</w:t>
+      </w:r>
+    </w:p>
+    <w:p>
+      <w:pPr>
+        <w:pStyle w:val="CommandBlock"/>
+        <w:keepNext/>
+      </w:pPr>
+      <w:r>
+        <w:t>npm pkg set "scripts.check=tsc --noEmit" "scripts.build=tsc --noEmitOnError"</w:t>
+      </w:r>
+    </w:p>
+    <w:p>
+      <w:pPr>
+        <w:pStyle w:val="CommandBlock"/>
+        <w:keepNext/>
+      </w:pPr>
+      <w:r>
+        <w:t>npm pkg delete version description main keywords author license scripts.test</w:t>
+      </w:r>
+    </w:p>
+    <w:p>
+      <w:pPr>
+        <w:pStyle w:val="CommandBlock"/>
+        <w:keepNext/>
+      </w:pPr>
+      <w:r>
+        <w:t>npm install --save-dev --save-exact typescript@7.0.2 @types/node@24.13.5 \</w:t>
+      </w:r>
+    </w:p>
+    <w:p>
+      <w:pPr>
+        <w:pStyle w:val="CommandBlock"/>
+        <w:keepNext/>
+      </w:pPr>
+      <w:r>
+        <w:t xml:space="preserve">    --ignore-scripts --no-audit --no-fund</w:t>
+      </w:r>
+    </w:p>
+    <w:p>
+      <w:pPr>
+        <w:pStyle w:val="CommandBlock"/>
+      </w:pPr>
+      <w:r>
+        <w:t>cd ..</w:t>
+      </w:r>
+    </w:p>
+    <w:p>
+      <w:pPr>
+        <w:keepNext/>
+      </w:pPr>
+    </w:p>
+    <w:p>
+      <w:r>
+        <w:t>Type typescript/tsconfig.json exactly as shown in the Windows setup. You save each source file in its language's section below, as each is shown. As in Chapter 1, nano ./c/basic/main.c creates and opens one: type the file, then save and close it with Ctrl+O, Enter, then Ctrl+X.</w:t>
       </w:r>
     </w:p>
     <w:p>
@@ -14265,7 +14663,7 @@
     </w:p>
     <w:p>
       <w:r>
-        <w:t>These files are the same as in Lesson 2.9, except that go.mod names this lesson's Go module, example.com/modules, which starts every import path of this project's Go packages.</w:t>
+        <w:t>These are the files the setup commands wrote, shown here so you can check yours. Your go line shows your own Go version, and the blank lines and the order of the package.json fields may differ.</w:t>
       </w:r>
     </w:p>
     <w:p>
@@ -14603,164 +15001,6 @@
       </w:pPr>
       <w:r>
         <w:t xml:space="preserve">  }</w:t>
-      </w:r>
-    </w:p>
-    <w:p>
-      <w:pPr>
-        <w:pStyle w:val="SourceCode"/>
-      </w:pPr>
-      <w:r>
-        <w:t>}</w:t>
-      </w:r>
-    </w:p>
-    <w:p>
-      <w:pPr>
-        <w:keepNext/>
-      </w:pPr>
-    </w:p>
-    <w:p>
-      <w:pPr>
-        <w:keepNext/>
-      </w:pPr>
-    </w:p>
-    <w:p>
-      <w:pPr>
-        <w:pStyle w:val="Heading2"/>
-      </w:pPr>
-      <w:r>
-        <w:t>typescript/tsconfig.json</w:t>
-      </w:r>
-    </w:p>
-    <w:p>
-      <w:pPr>
-        <w:pStyle w:val="SourceCode"/>
-        <w:keepNext/>
-      </w:pPr>
-      <w:r>
-        <w:t>{</w:t>
-      </w:r>
-    </w:p>
-    <w:p>
-      <w:pPr>
-        <w:pStyle w:val="SourceCode"/>
-        <w:keepNext/>
-      </w:pPr>
-      <w:r>
-        <w:t xml:space="preserve">  "compilerOptions": {</w:t>
-      </w:r>
-    </w:p>
-    <w:p>
-      <w:pPr>
-        <w:pStyle w:val="SourceCode"/>
-      </w:pPr>
-      <w:r>
-        <w:t xml:space="preserve">    "target": "ES2022",</w:t>
-      </w:r>
-    </w:p>
-    <w:p>
-      <w:pPr>
-        <w:pStyle w:val="SourceCode"/>
-      </w:pPr>
-      <w:r>
-        <w:t xml:space="preserve">    "module": "NodeNext",</w:t>
-      </w:r>
-    </w:p>
-    <w:p>
-      <w:pPr>
-        <w:pStyle w:val="SourceCode"/>
-      </w:pPr>
-      <w:r>
-        <w:t xml:space="preserve">    "moduleResolution": "NodeNext",</w:t>
-      </w:r>
-    </w:p>
-    <w:p>
-      <w:pPr>
-        <w:pStyle w:val="SourceCode"/>
-      </w:pPr>
-      <w:r>
-        <w:t xml:space="preserve">    "rootDir": "src",</w:t>
-      </w:r>
-    </w:p>
-    <w:p>
-      <w:pPr>
-        <w:pStyle w:val="SourceCode"/>
-      </w:pPr>
-      <w:r>
-        <w:t xml:space="preserve">    "outDir": "dist",</w:t>
-      </w:r>
-    </w:p>
-    <w:p>
-      <w:pPr>
-        <w:pStyle w:val="SourceCode"/>
-      </w:pPr>
-      <w:r>
-        <w:t xml:space="preserve">    "strict": true,</w:t>
-      </w:r>
-    </w:p>
-    <w:p>
-      <w:pPr>
-        <w:pStyle w:val="SourceCode"/>
-      </w:pPr>
-      <w:r>
-        <w:t xml:space="preserve">    "types": [</w:t>
-      </w:r>
-    </w:p>
-    <w:p>
-      <w:pPr>
-        <w:pStyle w:val="SourceCode"/>
-      </w:pPr>
-      <w:r>
-        <w:t xml:space="preserve">      "node"</w:t>
-      </w:r>
-    </w:p>
-    <w:p>
-      <w:pPr>
-        <w:pStyle w:val="SourceCode"/>
-      </w:pPr>
-      <w:r>
-        <w:t xml:space="preserve">    ],</w:t>
-      </w:r>
-    </w:p>
-    <w:p>
-      <w:pPr>
-        <w:pStyle w:val="SourceCode"/>
-      </w:pPr>
-      <w:r>
-        <w:t xml:space="preserve">    "moduleDetection": "force"</w:t>
-      </w:r>
-    </w:p>
-    <w:p>
-      <w:pPr>
-        <w:pStyle w:val="SourceCode"/>
-      </w:pPr>
-      <w:r>
-        <w:t xml:space="preserve">  },</w:t>
-      </w:r>
-    </w:p>
-    <w:p>
-      <w:pPr>
-        <w:pStyle w:val="SourceCode"/>
-      </w:pPr>
-      <w:r>
-        <w:t xml:space="preserve">  "include": [</w:t>
-      </w:r>
-    </w:p>
-    <w:p>
-      <w:pPr>
-        <w:pStyle w:val="SourceCode"/>
-        <w:keepNext/>
-      </w:pPr>
-      <w:r>
-        <w:t xml:space="preserve">    "src/**/*.ts"</w:t>
-      </w:r>
-    </w:p>
-    <w:p>
-      <w:pPr>
-        <w:pStyle w:val="SourceCode"/>
-        <w:keepNext/>
-      </w:pPr>
-      <w:r>
-        <w:t xml:space="preserve">  ]</w:t>
       </w:r>
     </w:p>
     <w:p>
@@ -15931,31 +16171,31 @@
       </w:rPr>
     </w:lvl>
   </w:abstractNum>
-  <w:num w:numId="1" w16cid:durableId="146020350">
+  <w:num w:numId="1" w16cid:durableId="1752387109">
     <w:abstractNumId w:val="8"/>
   </w:num>
-  <w:num w:numId="2" w16cid:durableId="1836610624">
+  <w:num w:numId="2" w16cid:durableId="101073909">
     <w:abstractNumId w:val="6"/>
   </w:num>
-  <w:num w:numId="3" w16cid:durableId="707031037">
+  <w:num w:numId="3" w16cid:durableId="566040512">
     <w:abstractNumId w:val="5"/>
   </w:num>
-  <w:num w:numId="4" w16cid:durableId="1142580994">
+  <w:num w:numId="4" w16cid:durableId="819736530">
     <w:abstractNumId w:val="4"/>
   </w:num>
-  <w:num w:numId="5" w16cid:durableId="747459283">
+  <w:num w:numId="5" w16cid:durableId="857237892">
     <w:abstractNumId w:val="7"/>
   </w:num>
-  <w:num w:numId="6" w16cid:durableId="501049907">
+  <w:num w:numId="6" w16cid:durableId="493648854">
     <w:abstractNumId w:val="3"/>
   </w:num>
-  <w:num w:numId="7" w16cid:durableId="2022776993">
+  <w:num w:numId="7" w16cid:durableId="226301904">
     <w:abstractNumId w:val="2"/>
   </w:num>
-  <w:num w:numId="8" w16cid:durableId="419376601">
+  <w:num w:numId="8" w16cid:durableId="1262374291">
     <w:abstractNumId w:val="1"/>
   </w:num>
-  <w:num w:numId="9" w16cid:durableId="1871604001">
+  <w:num w:numId="9" w16cid:durableId="1551838333">
     <w:abstractNumId w:val="0"/>
   </w:num>
 </w:numbering>

</xml_diff>

<commit_message>
Volume 1, Chapter 2: Lesson 2.17 setup fixes
</commit_message>
<xml_diff>
--- a/Volume 1/Chapter 02 - Language Fundamentals/SPA_Vol1_Ch2_Lesson2_10_Modules.docx
+++ b/Volume 1/Chapter 02 - Language Fundamentals/SPA_Vol1_Ch2_Lesson2_10_Modules.docx
@@ -95,10 +95,7 @@
     </w:p>
     <w:p>
       <w:r>
-        <w:t>Every program so far was one file. That works for 60 lines, but a program keeps growing, and one large file becomes hard to work with: finding the code for one job means reading past every other job, a change in one place can quietly break code far away that used the same names, and reusing a piece in another program means copying it. The two Chapter 2 projects each combine the pieces of a dozen lessons, far too much for one file. A module is a file, or in Go a folder, that holds the code for one purpose. T</w:t>
-      </w:r>
-      <w:r>
-        <w:t>he server module holds everything about a server, and the entry file, the file with main, only uses it. A module also decides what other files may use, so its private parts can change without breaking the files that use it.</w:t>
+        <w:t>Every program so far was one file. That works for 60 lines, but a program keeps growing, and one large file becomes hard to work with: finding the code for one job means reading past every other job, a change in one place can quietly break code far away that used the same names, and reusing a piece in another program means copying it. The two Chapter 2 projects each combine the pieces of a dozen lessons, far too much for one file. A module is a file, or in Go a folder, that holds the code for one purpose. The server module holds everything about a server, and the entry file, the file with main, only uses it. A module also decides what other files may use, so its private parts can change without breaking the files that use it.</w:t>
       </w:r>
     </w:p>
     <w:p>
@@ -1455,10 +1452,7 @@
     </w:p>
     <w:p>
       <w:r>
-        <w:t>C splits a module into two files. The header, server.h, is the module's public list: the Server type and a declaration of each function other files may call, which is the function's first line ending in a semicolon. The implementation file, server.c, holds the function bodies. main.c includes server.h, and one gcc command lists both .c files: gcc compiles each one on its own, then links them, joining main's calls to the bodies in server.c into one program. server.h is never listed, because each .c file incl</w:t>
-      </w:r>
-      <w:r>
-        <w:t>udes it. The Production-Minded version adds an include guard to the header and a private helper, marked static, that only server.c can call.</w:t>
+        <w:t>C splits a module into two files. The header, server.h, is the module's public list: the Server type and a declaration of each function other files may call, which is the function's first line ending in a semicolon. The implementation file, server.c, holds the function bodies. main.c includes server.h, and one gcc command lists both .c files: gcc compiles each one on its own, then links them, joining main's calls to the bodies in server.c into one program. server.h is never listed, because each .c file includes it. The Production-Minded version adds an include guard to the header and a private helper, marked static, that only server.c can call.</w:t>
       </w:r>
     </w:p>
     <w:p>
@@ -3963,10 +3957,7 @@
     </w:p>
     <w:p>
       <w:r>
-        <w:t>C++ splits a module into two files, as C does. The header, server.h, is the module's public list: the Server type and a declaration of each function other files may call, which is the function's first line ending in a semicolon. The implementation file, server.cpp, holds the function bodies. main.cpp includes server.h, and one g++ command lists both .cpp files: g++ compiles each one on its own, then links them into one program. server.h is never listed, because each .cpp file includes it. The Production-Min</w:t>
-      </w:r>
-      <w:r>
-        <w:t>ded version adds an include guard to the header and a private helper, marked static, that only server.cpp can call.</w:t>
+        <w:t>C++ splits a module into two files, as C does. The header, server.h, is the module's public list: the Server type and a declaration of each function other files may call, which is the function's first line ending in a semicolon. The implementation file, server.cpp, holds the function bodies. main.cpp includes server.h, and one g++ command lists both .cpp files: g++ compiles each one on its own, then links them into one program. server.h is never listed, because each .cpp file includes it. The Production-Minded version adds an include guard to the header and a private helper, marked static, that only server.cpp can call.</w:t>
       </w:r>
     </w:p>
     <w:p>
@@ -6511,10 +6502,7 @@
     </w:p>
     <w:p>
       <w:r>
-        <w:t>C# has no header files, and code in the same project needs no import line: dotnet build compiles every .cs file in the project folder into one program, so Program.cs uses the Server class in Server.cs by name. Every method in C# lives in a class, so the module's functions go in ServerModule, a static class: one that holds only static methods and is never created with new. Program calls ServerModule.PrintServer(web01), and the class name says where the method lives. Access words decide who may use each part:</w:t>
-      </w:r>
-      <w:r>
-        <w:t xml:space="preserve"> public, any code that can see the class; private, only code inside the class; and internal, on the two classes here, any file in this project. As in Lesson 2.9, the constructor is how a Server is created, so C# adds no create method.</w:t>
+        <w:t>C# has no header files, and code in the same project needs no import line: dotnet build compiles every .cs file in the project folder into one program, so Program.cs uses the Server class in Server.cs by name. Every method in C# lives in a class, so the module's functions go in ServerModule, a static class: one that holds only static methods and is never created with new. Program calls ServerModule.PrintServer(web01), and the class name says where the method lives. Access words decide who may use each part: public, any code that can see the class; private, only code inside the class; and internal, on the two classes here, any file in this project. As in Lesson 2.9, the constructor is how a Server is created, so C# adds no create method.</w:t>
       </w:r>
     </w:p>
     <w:p>
@@ -8667,13 +8655,7 @@
     </w:p>
     <w:p>
       <w:r>
-        <w:t>Go's unit of code is the package: a folder of .go files that all start with the same package line. The server code moves into its own folder, server, as package server, and main.go imports it by its import path, the module name from go.mod, example.com/modules, followed by the folder. A name is exported, usable outside its package, only when it starts with a capital letter, so the type, its fields, and the functions become Server, Hostname, CreateServer, and PrintServer. The enum's type and constants, Envir</w:t>
-      </w:r>
-      <w:r>
-        <w:t>onment, Production, Staging, and Development, were capitalized already, so main.go can write server.Production. In Lesson 2.9 everything was in package main, so lowercase fields were enough. main.go calls them as server.CreateServer: the package name, a dot, and the exported name. go build compiles the imported package itself, so the build command does not change. One word differs: Go calls the whole project that go.mod names a module, so in Go, what this lesson calls the server module is the server package</w:t>
-      </w:r>
-      <w:r>
-        <w:t>.</w:t>
+        <w:t>Go's unit of code is the package: a folder of .go files that all start with the same package line. The server code moves into its own folder, server, as package server, and main.go imports it by its import path, the module name from go.mod, example.com/modules, followed by the folder. A name is exported, usable outside its package, only when it starts with a capital letter, so the type, its fields, and the functions become Server, Hostname, CreateServer, and PrintServer. The enum's type and constants, Environment, Production, Staging, and Development, were capitalized already, so main.go can write server.Production. In Lesson 2.9 everything was in package main, so lowercase fields were enough. main.go calls them as server.CreateServer: the package name, a dot, and the exported name. go build compiles the imported package itself, so the build command does not change. One word differs: Go calls the whole project that go.mod names a module, so in Go, what this lesson calls the server module is the server package.</w:t>
       </w:r>
     </w:p>
     <w:p>
@@ -10973,10 +10955,7 @@
     </w:p>
     <w:p>
       <w:r>
-        <w:t>In Python every .py file is a module, named after the file: server.py is the module server. main.py imports the names it needs with from server import Environment, Server, print_server. Python looks for server.py in the folder of the file it was started with, runs it once, which defines its classes and functions, and makes the listed names usable in main.py. There is no build step, and no keyword for public or private: any top-level name can be imported. A leading underscore, as in the Production-Minded _en</w:t>
-      </w:r>
-      <w:r>
-        <w:t>abled_text, is a promise between programmers that the name belongs to the module. The Production-Minded main.py also uses the __name__ check first seen in Lesson 2.2, explained here in full. As in Lesson 2.9, the constructor is how a Server is created, so Python adds no create function.</w:t>
+        <w:t>In Python every .py file is a module, named after the file: server.py is the module server. main.py imports the names it needs with from server import Environment, Server, print_server. Python looks for server.py in the folder of the file it was started with, runs it once, which defines its classes and functions, and makes the listed names usable in main.py. There is no build step, and no keyword for public or private: any top-level name can be imported. A leading underscore, as in the Production-Minded _enabled_text, is a promise between programmers that the name belongs to the module. The Production-Minded main.py also uses the __name__ check first seen in Lesson 2.2, explained here in full. As in Lesson 2.9, the constructor is how a Server is created, so Python adds no create function.</w:t>
       </w:r>
     </w:p>
     <w:p>
@@ -12753,10 +12732,7 @@
     </w:p>
     <w:p>
       <w:r>
-        <w:t>In TypeScript every file is a module, and every name in it stays private to the file unless it is marked export. server.ts exports the Environment enum, the Server class, and printServer, and main.ts imports them with import { Environment, Server, printServer } from "./server.js". The path ends in .js, not .ts, because node runs the JavaScript files that tsc writes, and server.ts becomes server.js. tsc compiles every .ts file under src, so the build commands are the same as before, and dist gets the same fo</w:t>
-      </w:r>
-      <w:r>
-        <w:t>lders as src: .\typescript\dist\basic\main.js beside .\typescript\dist\basic\server.js. As in Lesson 2.9, the constructor is how a Server is created, so TypeScript adds no create function.</w:t>
+        <w:t>In TypeScript every file is a module, and every name in it stays private to the file unless it is marked export. server.ts exports the Environment enum, the Server class, and printServer, and main.ts imports them with import { Environment, Server, printServer } from "./server.js". The path ends in .js, not .ts, because node runs the JavaScript files that tsc writes, and server.ts becomes server.js. tsc compiles every .ts file under src, so the build commands are the same as before, and dist gets the same folders as src: .\typescript\dist\basic\main.js beside .\typescript\dist\basic\server.js. As in Lesson 2.9, the constructor is how a Server is created, so TypeScript adds no create function.</w:t>
       </w:r>
     </w:p>
     <w:p>
@@ -15359,10 +15335,7 @@
     </w:p>
     <w:p>
       <w:r>
-        <w:t>Both Chapter 2 projects are built from modules. The System Information Utility keeps each group of facts in its own module, a host record with its create and print functions like this lesson's server module, and later the readers for environment, host, and network-adapter information from Lessons 2.14 through 2.16, so its entry file only calls them in order and prints the report. The Command-Line Survey Application moves read_answer from Lesson 2.3 into an input module and its answer record into a record mo</w:t>
-      </w:r>
-      <w:r>
-        <w:t>dule, so its entry file reads as the questionnaire itself. This lesson's server module is the pattern for both: a record type, a create function, a print function, and private helpers, called from a short entry file. Lesson 2.11 adds error handling, and its port check is one more function that belongs in the server module.</w:t>
+        <w:t>Both Chapter 2 projects are built from modules. The System Information Utility keeps each group of facts in its own module, a host record with its create and print functions like this lesson's server module, and later the readers for environment, host, and network-adapter information from Lessons 2.14 through 2.16, so its entry file only calls them in order and prints the report. The Command-Line Survey Application moves read_answer from Lesson 2.3 into an input module and its answer record into a record module, so its entry file reads as the questionnaire itself. This lesson's server module is the pattern for both: a record type, a create function, a print function, and private helpers, called from a short entry file. Lesson 2.11 adds error handling, and its port check is one more function that belongs in the server module.</w:t>
       </w:r>
     </w:p>
     <w:p>
@@ -15403,10 +15376,7 @@
         <w:pStyle w:val="ListBullet"/>
       </w:pPr>
       <w:r>
-        <w:t>In main, directly after the second call that prints web-01, create db-01: a database server in staging on port 5432, enabled. Create it the same way web-01 was created, with the enum's staging name: create_server("db-01", STAGING, 5432, true) in C, createServer("db-01", Environment::Staging, 5432, true) in C++, server.CreateServer("db-01", server.Staging, 5432, true) in Go, new Server("db-01", Environment.Staging, 5432, true) in C# and TypeScript, and Server("db-01", Environment.STAGING, 5432, True) in Pyth</w:t>
-      </w:r>
-      <w:r>
-        <w:t>on. Store it in db_01 (db01) and print it with the module's print function.</w:t>
+        <w:t>In main, directly after the second call that prints web-01, create db-01: a database server in staging on port 5432, enabled. Create it the same way web-01 was created, with the enum's staging name: create_server("db-01", STAGING, 5432, true) in C, createServer("db-01", Environment::Staging, 5432, true) in C++, server.CreateServer("db-01", server.Staging, 5432, true) in Go, new Server("db-01", Environment.Staging, 5432, true) in C# and TypeScript, and Server("db-01", Environment.STAGING, 5432, True) in Python. Store it in db_01 (db01) and print it with the module's print function.</w:t>
       </w:r>
     </w:p>
     <w:p>
@@ -15982,10 +15952,7 @@
     </w:p>
     <w:p>
       <w:r>
-        <w:t>A module holds the code for one purpose, and the entry file uses it. The module decides what is public, the type and functions other files need, and what stays private, the helpers that can change without breaking anything outside. C and C++ put the public list in a header and the bodies in an implementation file, and list every source file in the build; C# compiles a project's files together; Go uses a package folder and capital letters; Python imports any name and trusts the underscore; TypeScript exports</w:t>
-      </w:r>
-      <w:r>
-        <w:t xml:space="preserve"> what other files may import. The program printed exactly what Lesson 2.9's did: only where the code lives changed. Lesson 2.11 turns to error handling: converting a port typed as text safely, and reporting either the port or a concise error.</w:t>
+        <w:t>A module holds the code for one purpose, and the entry file uses it. The module decides what is public, the type and functions other files need, and what stays private, the helpers that can change without breaking anything outside. C and C++ put the public list in a header and the bodies in an implementation file, and list every source file in the build; C# compiles a project's files together; Go uses a package folder and capital letters; Python imports any name and trusts the underscore; TypeScript exports what other files may import. The program printed exactly what Lesson 2.9's did: only where the code lives changed. Lesson 2.11 turns to error handling: converting a port typed as text safely, and reporting either the port or a concise error.</w:t>
       </w:r>
     </w:p>
     <w:sectPr>

</xml_diff>

<commit_message>
Volume 1, Chapter 2: updated lessons
</commit_message>
<xml_diff>
--- a/Volume 1/Chapter 02 - Language Fundamentals/SPA_Vol1_Ch2_Lesson2_10_Modules.docx
+++ b/Volume 1/Chapter 02 - Language Fundamentals/SPA_Vol1_Ch2_Lesson2_10_Modules.docx
@@ -95,7 +95,10 @@
     </w:p>
     <w:p>
       <w:r>
-        <w:t>Every program so far was one file. That works for 60 lines, but a program keeps growing, and one large file becomes hard to work with: finding the code for one job means reading past every other job, a change in one place can quietly break code far away that used the same names, and reusing a piece in another program means copying it. The two Chapter 2 projects each combine the pieces of a dozen lessons, far too much for one file. A module is a file, or in Go a folder, that holds the code for one purpose. The server module holds everything about a server, and the entry file, the file with main, only uses it. A module also decides what other files may use, so its private parts can change without breaking the files that use it.</w:t>
+        <w:t>Every program so far was one file. That works for 60 lines, but a program keeps growing, and one large file becomes hard to work with: finding the code for one job means reading past every other job, a change in one place can quietly break code far away that used the same names, and reusing a piece in another program means copying it. The two Chapter 2 projects each combine the pieces of a dozen lessons, far too much for one file. A module is a file, or in Go a folder, that holds the code for one purpose. T</w:t>
+      </w:r>
+      <w:r>
+        <w:t>he server module holds everything about a server, and the entry file, the file with main, only uses it. A module also decides what other files may use, so its private parts can change without breaking the files that use it.</w:t>
       </w:r>
     </w:p>
     <w:p>
@@ -492,6 +495,7 @@
         <w:pStyle w:val="CommandBlock"/>
       </w:pPr>
       <w:r>
+        <w:lastRenderedPageBreak/>
         <w:t xml:space="preserve">  cpp/basic/server.h</w:t>
       </w:r>
     </w:p>
@@ -1452,7 +1456,10 @@
     </w:p>
     <w:p>
       <w:r>
-        <w:t>C splits a module into two files. The header, server.h, is the module's public list: the Server type and a declaration of each function other files may call, which is the function's first line ending in a semicolon. The implementation file, server.c, holds the function bodies. main.c includes server.h, and one gcc command lists both .c files: gcc compiles each one on its own, then links them, joining main's calls to the bodies in server.c into one program. server.h is never listed, because each .c file includes it. The Production-Minded version adds an include guard to the header and a private helper, marked static, that only server.c can call.</w:t>
+        <w:t>C splits a module into two files. The header, server.h, is the module's public list: the Server type and a declaration of each function other files may call, which is the function's first line ending in a semicolon. The implementation file, server.c, holds the function bodies. main.c includes server.h, and one gcc command lists both .c files: gcc compiles each one on its own, then links them, joining main's calls to the bodies in server.c into one program. server.h is never listed, because each .c file incl</w:t>
+      </w:r>
+      <w:r>
+        <w:t>udes it. The Production-Minded version adds an include guard to the header and a private helper, marked static, that only server.c can call.</w:t>
       </w:r>
     </w:p>
     <w:p>
@@ -3957,7 +3964,10 @@
     </w:p>
     <w:p>
       <w:r>
-        <w:t>C++ splits a module into two files, as C does. The header, server.h, is the module's public list: the Server type and a declaration of each function other files may call, which is the function's first line ending in a semicolon. The implementation file, server.cpp, holds the function bodies. main.cpp includes server.h, and one g++ command lists both .cpp files: g++ compiles each one on its own, then links them into one program. server.h is never listed, because each .cpp file includes it. The Production-Minded version adds an include guard to the header and a private helper, marked static, that only server.cpp can call.</w:t>
+        <w:t>C++ splits a module into two files, as C does. The header, server.h, is the module's public list: the Server type and a declaration of each function other files may call, which is the function's first line ending in a semicolon. The implementation file, server.cpp, holds the function bodies. main.cpp includes server.h, and one g++ command lists both .cpp files: g++ compiles each one on its own, then links them into one program. server.h is never listed, because each .cpp file includes it. The Production-Min</w:t>
+      </w:r>
+      <w:r>
+        <w:t>ded version adds an include guard to the header and a private helper, marked static, that only server.cpp can call.</w:t>
       </w:r>
     </w:p>
     <w:p>
@@ -6502,7 +6512,10 @@
     </w:p>
     <w:p>
       <w:r>
-        <w:t>C# has no header files, and code in the same project needs no import line: dotnet build compiles every .cs file in the project folder into one program, so Program.cs uses the Server class in Server.cs by name. Every method in C# lives in a class, so the module's functions go in ServerModule, a static class: one that holds only static methods and is never created with new. Program calls ServerModule.PrintServer(web01), and the class name says where the method lives. Access words decide who may use each part: public, any code that can see the class; private, only code inside the class; and internal, on the two classes here, any file in this project. As in Lesson 2.9, the constructor is how a Server is created, so C# adds no create method.</w:t>
+        <w:t>C# has no header files, and code in the same project needs no import line: dotnet build compiles every .cs file in the project folder into one program, so Program.cs uses the Server class in Server.cs by name. Every method in C# lives in a class, so the module's functions go in ServerModule, a static class: one that holds only static methods and is never created with new. Program calls ServerModule.PrintServer(web01), and the class name says where the method lives. Access words decide who may use each part:</w:t>
+      </w:r>
+      <w:r>
+        <w:t xml:space="preserve"> public, any code that can see the class; private, only code inside the class; and internal, on the two classes here, any file in this project. As in Lesson 2.9, the constructor is how a Server is created, so C# adds no create method.</w:t>
       </w:r>
     </w:p>
     <w:p>
@@ -8655,7 +8668,13 @@
     </w:p>
     <w:p>
       <w:r>
-        <w:t>Go's unit of code is the package: a folder of .go files that all start with the same package line. The server code moves into its own folder, server, as package server, and main.go imports it by its import path, the module name from go.mod, example.com/modules, followed by the folder. A name is exported, usable outside its package, only when it starts with a capital letter, so the type, its fields, and the functions become Server, Hostname, CreateServer, and PrintServer. The enum's type and constants, Environment, Production, Staging, and Development, were capitalized already, so main.go can write server.Production. In Lesson 2.9 everything was in package main, so lowercase fields were enough. main.go calls them as server.CreateServer: the package name, a dot, and the exported name. go build compiles the imported package itself, so the build command does not change. One word differs: Go calls the whole project that go.mod names a module, so in Go, what this lesson calls the server module is the server package.</w:t>
+        <w:t>Go's unit of code is the package: a folder of .go files that all start with the same package line. The server code moves into its own folder, server, as package server, and main.go imports it by its import path, the module name from go.mod, example.com/modules, followed by the folder. A name is exported, usable outside its package, only when it starts with a capital letter, so the type, its fields, and the functions become Server, Hostname, CreateServer, and PrintServer. The enum's type and constants, Envir</w:t>
+      </w:r>
+      <w:r>
+        <w:t>onment, Production, Staging, and Development, were capitalized already, so main.go can write server.Production. In Lesson 2.9 everything was in package main, so lowercase fields were enough. main.go calls them as server.CreateServer: the package name, a dot, and the exported name. go build compiles the imported package itself, so the build command does not change. One word differs: Go calls the whole project that go.mod names a module, so in Go, what this lesson calls the server module is the server package</w:t>
+      </w:r>
+      <w:r>
+        <w:t>.</w:t>
       </w:r>
     </w:p>
     <w:p>
@@ -8717,23 +8736,23 @@
         <w:pStyle w:val="SourceCode"/>
       </w:pPr>
       <w:r>
-        <w:t>// basic/server, so its package is named server. main.go imports it and</w:t>
-      </w:r>
-    </w:p>
-    <w:p>
-      <w:pPr>
-        <w:pStyle w:val="SourceCode"/>
-      </w:pPr>
-      <w:r>
-        <w:t>// calls its functions as server.CreateServer and server.PrintServer. (Go</w:t>
-      </w:r>
-    </w:p>
-    <w:p>
-      <w:pPr>
-        <w:pStyle w:val="SourceCode"/>
-      </w:pPr>
-      <w:r>
-        <w:t>// uses the word module for the whole project that go.mod names.)</w:t>
+        <w:t>// basic/server, and by Go's habit the package line names it server.</w:t>
+      </w:r>
+    </w:p>
+    <w:p>
+      <w:pPr>
+        <w:pStyle w:val="SourceCode"/>
+      </w:pPr>
+      <w:r>
+        <w:t>// main.go imports it and calls server.CreateServer and server.PrintServer.</w:t>
+      </w:r>
+    </w:p>
+    <w:p>
+      <w:pPr>
+        <w:pStyle w:val="SourceCode"/>
+      </w:pPr>
+      <w:r>
+        <w:t>// (Go uses the word module for the whole project that go.mod names.)</w:t>
       </w:r>
     </w:p>
     <w:p>
@@ -10955,7 +10974,10 @@
     </w:p>
     <w:p>
       <w:r>
-        <w:t>In Python every .py file is a module, named after the file: server.py is the module server. main.py imports the names it needs with from server import Environment, Server, print_server. Python looks for server.py in the folder of the file it was started with, runs it once, which defines its classes and functions, and makes the listed names usable in main.py. There is no build step, and no keyword for public or private: any top-level name can be imported. A leading underscore, as in the Production-Minded _enabled_text, is a promise between programmers that the name belongs to the module. The Production-Minded main.py also uses the __name__ check first seen in Lesson 2.2, explained here in full. As in Lesson 2.9, the constructor is how a Server is created, so Python adds no create function.</w:t>
+        <w:t>In Python every .py file is a module, named after the file: server.py is the module server. main.py imports the names it needs with from server import Environment, Server, print_server. Python looks for server.py in the folder of the file it was started with, runs it once, which defines its classes and functions, and makes the listed names usable in main.py. There is no build step, and no keyword for public or private: any top-level name can be imported. A leading underscore, as in the Production-Minded _en</w:t>
+      </w:r>
+      <w:r>
+        <w:t>abled_text, is a promise between programmers that the name belongs to the module. The Production-Minded main.py also uses the __name__ check first seen in Lesson 2.2, explained here in full. As in Lesson 2.9, the constructor is how a Server is created, so Python adds no create function.</w:t>
       </w:r>
     </w:p>
     <w:p>
@@ -11378,31 +11400,31 @@
         <w:pStyle w:val="SourceCode"/>
       </w:pPr>
       <w:r>
-        <w:t># finds server.py in the same folder as main.py, runs it once, which</w:t>
-      </w:r>
-    </w:p>
-    <w:p>
-      <w:pPr>
-        <w:pStyle w:val="SourceCode"/>
-      </w:pPr>
-      <w:r>
-        <w:t># defines its classes and function, and makes those three names usable</w:t>
-      </w:r>
-    </w:p>
-    <w:p>
-      <w:pPr>
-        <w:pStyle w:val="SourceCode"/>
-      </w:pPr>
-      <w:r>
-        <w:t># here. Python looks for the</w:t>
-      </w:r>
-    </w:p>
-    <w:p>
-      <w:pPr>
-        <w:pStyle w:val="SourceCode"/>
-      </w:pPr>
-      <w:r>
-        <w:t># module in the folder of the file it was started with.</w:t>
+        <w:t># looks for server.py in the folder of the file Python was started with,</w:t>
+      </w:r>
+    </w:p>
+    <w:p>
+      <w:pPr>
+        <w:pStyle w:val="SourceCode"/>
+      </w:pPr>
+      <w:r>
+        <w:t># here main.py's own folder. It runs server.py once, which defines its</w:t>
+      </w:r>
+    </w:p>
+    <w:p>
+      <w:pPr>
+        <w:pStyle w:val="SourceCode"/>
+      </w:pPr>
+      <w:r>
+        <w:t># classes and function, and makes those three names usable here, so</w:t>
+      </w:r>
+    </w:p>
+    <w:p>
+      <w:pPr>
+        <w:pStyle w:val="SourceCode"/>
+      </w:pPr>
+      <w:r>
+        <w:t># main.py never repeats them.</w:t>
       </w:r>
     </w:p>
     <w:p>
@@ -12732,7 +12754,10 @@
     </w:p>
     <w:p>
       <w:r>
-        <w:t>In TypeScript every file is a module, and every name in it stays private to the file unless it is marked export. server.ts exports the Environment enum, the Server class, and printServer, and main.ts imports them with import { Environment, Server, printServer } from "./server.js". The path ends in .js, not .ts, because node runs the JavaScript files that tsc writes, and server.ts becomes server.js. tsc compiles every .ts file under src, so the build commands are the same as before, and dist gets the same folders as src: .\typescript\dist\basic\main.js beside .\typescript\dist\basic\server.js. As in Lesson 2.9, the constructor is how a Server is created, so TypeScript adds no create function.</w:t>
+        <w:t>In TypeScript every file is a module, and every name in it stays private to the file unless it is marked export. server.ts exports the Environment enum, the Server class, and printServer, and main.ts imports them with import { Environment, Server, printServer } from "./server.js". The path ends in .js, not .ts, because node runs the JavaScript files that tsc writes, and server.ts becomes server.js. tsc compiles every .ts file under src, so the build commands are the same as before, and dist gets the same fo</w:t>
+      </w:r>
+      <w:r>
+        <w:t>lders as src: .\typescript\dist\basic\main.js beside .\typescript\dist\basic\server.js. As in Lesson 2.9, the constructor is how a Server is created, so TypeScript adds no create function.</w:t>
       </w:r>
     </w:p>
     <w:p>
@@ -15335,7 +15360,10 @@
     </w:p>
     <w:p>
       <w:r>
-        <w:t>Both Chapter 2 projects are built from modules. The System Information Utility keeps each group of facts in its own module, a host record with its create and print functions like this lesson's server module, and later the readers for environment, host, and network-adapter information from Lessons 2.14 through 2.16, so its entry file only calls them in order and prints the report. The Command-Line Survey Application moves read_answer from Lesson 2.3 into an input module and its answer record into a record module, so its entry file reads as the questionnaire itself. This lesson's server module is the pattern for both: a record type, a create function, a print function, and private helpers, called from a short entry file. Lesson 2.11 adds error handling, and its port check is one more function that belongs in the server module.</w:t>
+        <w:t>Both Chapter 2 projects are built from modules. The System Information Utility keeps each group of facts in its own module, a host record with its create and print functions like this lesson's server module, and later the readers for environment, host, and network-adapter information from Lessons 2.14 through 2.16, so its entry file only calls them in order and prints the report. The Command-Line Survey Application moves read_answer from Lesson 2.3 into an input module and its answer record into a record mo</w:t>
+      </w:r>
+      <w:r>
+        <w:t>dule, so its entry file reads as the questionnaire itself. This lesson's server module is the pattern for both: a record type, a create function, a print function, and private helpers, called from a short entry file. Lesson 2.11 adds error handling, and its port check is one more function that belongs in the server module.</w:t>
       </w:r>
     </w:p>
     <w:p>
@@ -15376,7 +15404,10 @@
         <w:pStyle w:val="ListBullet"/>
       </w:pPr>
       <w:r>
-        <w:t>In main, directly after the second call that prints web-01, create db-01: a database server in staging on port 5432, enabled. Create it the same way web-01 was created, with the enum's staging name: create_server("db-01", STAGING, 5432, true) in C, createServer("db-01", Environment::Staging, 5432, true) in C++, server.CreateServer("db-01", server.Staging, 5432, true) in Go, new Server("db-01", Environment.Staging, 5432, true) in C# and TypeScript, and Server("db-01", Environment.STAGING, 5432, True) in Python. Store it in db_01 (db01) and print it with the module's print function.</w:t>
+        <w:t>In main, directly after the second call that prints web-01, create db-01: a database server in staging on port 5432, enabled. Create it the same way web-01 was created, with the enum's staging name: create_server("db-01", STAGING, 5432, true) in C, createServer("db-01", Environment::Staging, 5432, true) in C++, server.CreateServer("db-01", server.Staging, 5432, true) in Go, new Server("db-01", Environment.Staging, 5432, true) in C# and TypeScript, and Server("db-01", Environment.STAGING, 5432, True) in Pyth</w:t>
+      </w:r>
+      <w:r>
+        <w:t>on. Store it in db_01 (db01) and print it with the module's print function.</w:t>
       </w:r>
     </w:p>
     <w:p>
@@ -15952,7 +15983,10 @@
     </w:p>
     <w:p>
       <w:r>
-        <w:t>A module holds the code for one purpose, and the entry file uses it. The module decides what is public, the type and functions other files need, and what stays private, the helpers that can change without breaking anything outside. C and C++ put the public list in a header and the bodies in an implementation file, and list every source file in the build; C# compiles a project's files together; Go uses a package folder and capital letters; Python imports any name and trusts the underscore; TypeScript exports what other files may import. The program printed exactly what Lesson 2.9's did: only where the code lives changed. Lesson 2.11 turns to error handling: converting a port typed as text safely, and reporting either the port or a concise error.</w:t>
+        <w:t>A module holds the code for one purpose, and the entry file uses it. The module decides what is public, the type and functions other files need, and what stays private, the helpers that can change without breaking anything outside. C and C++ put the public list in a header and the bodies in an implementation file, and list every source file in the build; C# compiles a project's files together; Go uses a package folder and capital letters; Python imports any name and trusts the underscore; TypeScript exports</w:t>
+      </w:r>
+      <w:r>
+        <w:t xml:space="preserve"> what other files may import. The program printed exactly what Lesson 2.9's did: only where the code lives changed. Lesson 2.11 turns to error handling: converting a port typed as text safely, and reporting either the port or a concise error.</w:t>
       </w:r>
     </w:p>
     <w:sectPr>
@@ -16138,31 +16172,31 @@
       </w:rPr>
     </w:lvl>
   </w:abstractNum>
-  <w:num w:numId="1" w16cid:durableId="1752387109">
+  <w:num w:numId="1" w16cid:durableId="1049913856">
     <w:abstractNumId w:val="8"/>
   </w:num>
-  <w:num w:numId="2" w16cid:durableId="101073909">
+  <w:num w:numId="2" w16cid:durableId="1872377825">
     <w:abstractNumId w:val="6"/>
   </w:num>
-  <w:num w:numId="3" w16cid:durableId="566040512">
+  <w:num w:numId="3" w16cid:durableId="669797587">
     <w:abstractNumId w:val="5"/>
   </w:num>
-  <w:num w:numId="4" w16cid:durableId="819736530">
+  <w:num w:numId="4" w16cid:durableId="351301531">
     <w:abstractNumId w:val="4"/>
   </w:num>
-  <w:num w:numId="5" w16cid:durableId="857237892">
+  <w:num w:numId="5" w16cid:durableId="210308963">
     <w:abstractNumId w:val="7"/>
   </w:num>
-  <w:num w:numId="6" w16cid:durableId="493648854">
+  <w:num w:numId="6" w16cid:durableId="839346397">
     <w:abstractNumId w:val="3"/>
   </w:num>
-  <w:num w:numId="7" w16cid:durableId="226301904">
+  <w:num w:numId="7" w16cid:durableId="315495698">
     <w:abstractNumId w:val="2"/>
   </w:num>
-  <w:num w:numId="8" w16cid:durableId="1262374291">
+  <w:num w:numId="8" w16cid:durableId="2032873883">
     <w:abstractNumId w:val="1"/>
   </w:num>
-  <w:num w:numId="9" w16cid:durableId="1551838333">
+  <w:num w:numId="9" w16cid:durableId="722994119">
     <w:abstractNumId w:val="0"/>
   </w:num>
 </w:numbering>

</xml_diff>